<commit_message>
Tighten v9 after examiner pass: source-exact study descriptions, consistency fixes
Words Choi et al. and Yun et al. exactly as their published records state,
aligns the insufficient-explanation example and code names with Appendix D,
removes remaining overclaims (synthesis, "systematic", population-level
equity), fixes the pilot/prompt timeline, and trims repeated wording.

Co-Authored-By: Claude Opus 5.5 <noreply@anthropic.com>
Claude-Session: https://claude.ai/code/session_01ErbEvZi6kZy9sgfMskNu17
</commit_message>
<xml_diff>
--- a/PhD_Proposal_v9.docx
+++ b/PhD_Proposal_v9.docx
@@ -244,7 +244,7 @@
           <w:sz w:val="24"/>
           <w:szCs w:val="24"/>
         </w:rPr>
-        <w:t xml:space="preserve">Consumer generative AI has entered teachers’ marking. Teachers now use general-purpose chat applications for many professional tasks, including marking. In a spring 2025 survey of 2,232 United States public school teachers, 60% reported using an AI tool for their work during the 2024–25 school year, and 16% reported using AI tools to grade or provide feedback (Gallup &amp; Walton Family Foundation, 2025). An analysis of educators’ conversations with Claude found that assessing student performance accounted for about 7% of the conversations analysed, that 48.9% of grading-related conversations were automation-heavy, and that surveyed faculty rated grading as the area in which AI was least effective (Anthropic, 2025a). These populations differ from teachers in Iraq or Malaysia, but the figures indicate that using a consumer chat application as a marker is an existing practice.</w:t>
+        <w:t xml:space="preserve">Consumer generative AI has entered teachers’ marking. Teachers now use general-purpose chat applications for many professional tasks, including marking. In a spring 2025 survey of 2,232 United States public school teachers, 60% reported using an AI tool for their work during the 2024–25 school year, and 16% reported using AI tools to grade or provide feedback (Gallup &amp; Walton Family Foundation, 2025). An analysis of educators’ conversations with Claude found that assessing student performance accounted for about 7% of the conversations analysed, that 48.9% of grading-related conversations were automation-heavy, and that surveyed faculty rated grading as the area in which AI was least effective (Anthropic, 2025). These populations differ from teachers in Iraq or Malaysia, but the figures indicate that using a consumer chat application as a marker is an existing practice.</w:t>
       </w:r>
     </w:p>
     <w:p>
@@ -344,7 +344,7 @@
           <w:sz w:val="24"/>
           <w:szCs w:val="24"/>
         </w:rPr>
-        <w:t xml:space="preserve">Teachers who use ChatGPT or Claude through consumer subscriptions to mark student writing do so without evidence on the properties of the resulting scores. For this task, this population and this mode of use, it is not known how consistently the same script is marked when submitted repeatedly in independent sessions (pass-to-pass consistency); how closely the marks agree with trained human raters on each criterion (agreement); whether these properties hold across different passages within the same task type (passage dependence); or what the AI tool’s scoring rationale reveals when its mark diverges from human judgement, particularly for second-language learners whose writing may be penalised or credited on construct-irrelevant grounds.</w:t>
+        <w:t xml:space="preserve">Teachers who use ChatGPT or Claude through consumer subscriptions to mark student writing do so without evidence on the properties of the resulting scores. For this task, this population and this mode of use, it is not known how consistently the same script is marked when submitted repeatedly in independent sessions (pass-to-pass consistency); how closely the marks agree with trained human raters on each criterion (agreement); whether these properties hold across different passages within the same task type (passage dependence); or what the AI tool’s scoring rationale reveals in divergent and close-agreement cases, particularly for second-language learners whose writing may be penalised or credited on construct-irrelevant grounds.</w:t>
       </w:r>
     </w:p>
     <w:p>
@@ -749,7 +749,7 @@
                 <w:sz w:val="22"/>
                 <w:szCs w:val="22"/>
               </w:rPr>
-              <w:t xml:space="preserve">What justifications do the AI tools provide for their marks in selected high-divergence and close-agreement cases, how well do those justifications accord with the available textual evidence, and what do they reveal about how the tools handle source fidelity, construct-irrelevant features and non-standard but meaningful phrasing in this multilingual sample?</w:t>
+              <w:t xml:space="preserve">What justifications do the AI tools provide for their marks in selected high-divergence and close-agreement cases, how well do those justifications accord with the available textual evidence and with the criterion each is offered for, and what do they reveal about how the tools handle source fidelity, construct-irrelevant features and non-standard but meaningful phrasing in this multilingual sample?</w:t>
             </w:r>
           </w:p>
         </w:tc>
@@ -770,7 +770,7 @@
                 <w:sz w:val="22"/>
                 <w:szCs w:val="22"/>
               </w:rPr>
-              <w:t xml:space="preserve">The scoring correction gap explained</w:t>
+              <w:t xml:space="preserve">Justifications examined</w:t>
             </w:r>
           </w:p>
         </w:tc>
@@ -923,7 +923,7 @@
           <w:sz w:val="24"/>
           <w:szCs w:val="24"/>
         </w:rPr>
-        <w:t xml:space="preserve">The study applies an argument-based approach (Kane, 2013) to a use outside the operational settings for which automated scoring frameworks were developed (Williamson et al., 2012; Xi, 2010), showing which inferences in a teacher’s use of an AI mark can be supported in a qualification-relevant classroom context (IGCSE). The reading–writing criterion-separation analysis contributes to the broader question of whether AI scoring introduces construct-irrelevant variance for L2 populations.</w:t>
+        <w:t xml:space="preserve">The study applies an argument-based approach (Kane, 2013) to a use outside the operational settings for which automated scoring frameworks were developed (Williamson et al., 2012; Xi, 2010), showing which inferences in a teacher’s use of an AI mark can be supported in a qualification-relevant classroom context (IGCSE). The reading–writing criterion-separation analysis contributes evidence, within this multilingual sample, on whether AI scoring introduces construct-irrelevant variance.</w:t>
       </w:r>
     </w:p>
     <w:p>
@@ -1001,7 +1001,7 @@
           <w:sz w:val="24"/>
           <w:szCs w:val="24"/>
         </w:rPr>
-        <w:t xml:space="preserve">Variation in the scores a single tool assigns to the same script across three independent passes in separate sessions within a ten-working-day window, under the same framing. This estimate includes both within-session random variation and any between-session variation from the service. With three passes, the estimate of within-script variability rests on three scores per script, providing a within-script variance estimate that does not depend on a single difference. Also referred to as pass-to-pass consistency in this proposal.</w:t>
+        <w:t xml:space="preserve">Variation in the scores a single tool assigns to the same script across three independent passes in separate sessions within a ten-working-day window, under the same framing. This estimate includes both within-session random variation and any between-session variation from the service. Also referred to as pass-to-pass consistency in this proposal.</w:t>
       </w:r>
     </w:p>
     <w:p>
@@ -1346,7 +1346,7 @@
           <w:sz w:val="24"/>
           <w:szCs w:val="24"/>
         </w:rPr>
-        <w:t xml:space="preserve">Two recent studies bring adolescents’ source-based writing into this literature. Choi et al. (2026) examined LLM scoring of secondary students’ argumentative essays under different prompt designs and found that adding anchor papers to the rubric and source materials brought LLM–human agreement on holistic scores closer to human–human reliability. Yun et al. (2026) proposed a knowledge-graph and LLM-based framework for assessing source-based writing that models the pathway from reading a source to writing a response. Adolescent source-based AI assessment, and the separation of source comprehension from written expression, are therefore active areas of research. Neither study, to the author’s knowledge, audits a consumer scorer’s stated justifications for separate reading and writing marks against the source, the student text and the rubric.</w:t>
+        <w:t xml:space="preserve">Two recent studies extend this literature to source-based writing. Choi et al. (2026) examined LLM holistic scoring of secondary school students’ argumentative essays, comparing prompts that incorporated grading rubrics, source materials and anchor papers, and found that providing anchor papers significantly improved LLM–human agreement, bringing it closer to human–human reliability. Yun et al. (2026) proposed a knowledge-graph and LLM-based assessment framework that models the reading-to-writing pipeline in source-based writing. LLM scoring of secondary students’ source-based writing, and LLM-based modelling of reading-to-writing, are therefore active areas of research. Neither study, to the author’s knowledge, audits a consumer scorer’s stated justifications for separate reading and writing marks against the source, the student text and the rubric.</w:t>
       </w:r>
     </w:p>
     <w:p>
@@ -1570,7 +1570,7 @@
           <w:sz w:val="24"/>
           <w:szCs w:val="24"/>
         </w:rPr>
-        <w:t xml:space="preserve">As discussed in Section 2.4, these studies show that LLM assessment of adolescents’ source-based writing, and the modelling of source comprehension in writing assessment, are already under investigation. The present study’s gap is therefore narrower: whether consumer AI scoring preserves a rubric’s separate reading and writing criteria, and how a reproducible audit can identify unsupported or misapplied justifications in selected cases.</w:t>
+        <w:t xml:space="preserve">As discussed in Section 2.4, these studies show that LLM scoring of secondary students’ source-based writing, and LLM-based modelling of reading-to-writing, are already under investigation. The present study’s gap is therefore narrower: whether consumer AI scoring preserves a rubric’s separate reading and writing criteria, and how a reproducible audit can identify unsupported or misapplied justifications in selected cases.</w:t>
       </w:r>
     </w:p>
     <w:p>
@@ -2100,7 +2100,7 @@
                 <w:sz w:val="22"/>
                 <w:szCs w:val="22"/>
               </w:rPr>
-              <w:t xml:space="preserve">Secondary students’ source-based argumentative essays; GPT-4o, GPT-4o mini and other LLMs</w:t>
+              <w:t xml:space="preserve">Secondary school students’ argumentative essays, with source materials; several LLMs including GPT-4o and GPT-4o mini</w:t>
             </w:r>
           </w:p>
         </w:tc>
@@ -2121,7 +2121,7 @@
                 <w:sz w:val="22"/>
                 <w:szCs w:val="22"/>
               </w:rPr>
-              <w:t xml:space="preserve">Prompt design matters: adding anchor papers to the rubric and source materials improves LLM–human agreement on holistic scores</w:t>
+              <w:t xml:space="preserve">Prompts with rubrics, source materials and anchor papers compared; anchor papers significantly improve LLM–human agreement on holistic scores</w:t>
             </w:r>
           </w:p>
         </w:tc>
@@ -2278,7 +2278,7 @@
                 <w:sz w:val="22"/>
                 <w:szCs w:val="22"/>
               </w:rPr>
-              <w:t xml:space="preserve">Students’ source-based writing</w:t>
+              <w:t xml:space="preserve">Source-based writing</w:t>
             </w:r>
           </w:p>
         </w:tc>
@@ -2299,7 +2299,7 @@
                 <w:sz w:val="22"/>
                 <w:szCs w:val="22"/>
               </w:rPr>
-              <w:t xml:space="preserve">A knowledge-graph and LLM-based framework modelling the reading-to-writing pathway</w:t>
+              <w:t xml:space="preserve">A knowledge-graph and LLM-based assessment framework modelling the reading-to-writing pipeline</w:t>
             </w:r>
           </w:p>
         </w:tc>
@@ -2540,7 +2540,7 @@
           <w:sz w:val="24"/>
           <w:szCs w:val="24"/>
         </w:rPr>
-        <w:t xml:space="preserve">The study adopts an argument-based view of validity (AERA et al., 2014; Kane, 2013; Messick, 1989), in which a teacher’s use of an AI mark rests on a chain of inferences. Each research question supplies evidence for one or more inferences, and the discrepancy-review evidence base is the synthesis that follows.</w:t>
+        <w:t xml:space="preserve">The study adopts an argument-based view of validity (AERA et al., 2014; Kane, 2013; Messick, 1989), in which a teacher’s use of an AI mark rests on a chain of inferences. Each research question supplies evidence for one or more inferences, and the synthesis draws the evidence together.</w:t>
       </w:r>
     </w:p>
     <w:tbl>
@@ -3009,7 +3009,7 @@
                 <w:sz w:val="22"/>
                 <w:szCs w:val="22"/>
               </w:rPr>
-              <w:t xml:space="preserve">AI rationales reveal systematic misapplication of the rubric, confusion of reading and writing constructs, or penalisation of communicatively effective language features</w:t>
+              <w:t xml:space="preserve">AI rationales in the selected cases show misapplication of the rubric, confusion of reading and writing constructs, or penalisation of communicatively effective language features</w:t>
             </w:r>
           </w:p>
         </w:tc>
@@ -3618,7 +3618,7 @@
           <w:sz w:val="24"/>
           <w:szCs w:val="24"/>
         </w:rPr>
-        <w:t xml:space="preserve">Every submission contains the passage, the task and the student’s summary, mirroring the human condition. The rubric-embedded framing contains the mark allocation (10 for reading, 5 for writing), a fixed output line (“Reading _/10; Writing _/5”), a request for a separate brief justification for the reading mark and for the writing mark, each with reference to the relevant level descriptors, the study rubric and the appropriate reading key for the passage. Rules for refusals and out-of-range or unparseable answers will be fixed in advance. The wording will be checked in the pilot, then fixed before data collection and never changed; a draft is in Appendix A. Requesting separate justifications makes each statement attributable to the mark it supports. The framing does not instruct the tools to keep the criteria separate, because that would coach the behaviour under study; the findings therefore describe scoring under this fixed prompting procedure.</w:t>
+        <w:t xml:space="preserve">Every submission contains the passage, the task and the student’s summary, mirroring the human condition. The rubric-embedded framing contains the mark allocation (10 for reading, 5 for writing); a fixed output line (“Reading _/10; Writing _/5”); a request for a separate brief justification for each mark, with reference to the relevant level descriptors; the study rubric; and the appropriate reading key for the passage. Rules for refusals and out-of-range or unparseable answers will be fixed in advance. The wording will be checked in the pilot, then fixed before data collection and never changed; a draft is in Appendix A. Requesting separate justifications makes each statement attributable to the mark it supports. The framing does not instruct the tools to keep the criteria separate, because that would coach the behaviour under study; the findings therefore describe scoring under this fixed prompting procedure.</w:t>
       </w:r>
     </w:p>
     <w:p>
@@ -4089,7 +4089,7 @@
           <w:sz w:val="24"/>
           <w:szCs w:val="24"/>
         </w:rPr>
-        <w:t xml:space="preserve">The pilot AI responses are also used to test the evidence-checking procedure before the main study. Both coders will independently segment and code the Pass 1 justifications for four pilot scripts (eight rationale texts, two tools per script), using the draft coding manual and evidence-record template (Appendix D). Differences in segmentation and disagreements on the evidential, criterion-appropriateness and thematic judgements are used to revise the segmentation guidelines, category definitions and worked examples, and to check that the separate-justification wording yields statements attributable to each mark. The revised manual is then fixed for the main study. Pilot coding does not enter the main analysis; the revisions and their reasons are recorded in the pilot log.</w:t>
+        <w:t xml:space="preserve">The pilot AI responses are also used to test the evidence-checking procedure before the main study. Both coders will independently segment and code the Pass 1 justifications for four pilot scripts (segmentation is tested deliberately in the pilot; in the main study, both coders work from one pre-segmented claim list) (eight rationale texts, two tools per script), using the draft coding manual and evidence-record template (Appendix D). Differences in segmentation and disagreements on the evidential, criterion-appropriateness and thematic judgements are used to revise the segmentation guidelines, category definitions and worked examples, and to check that the separate-justification wording yields statements attributable to each mark. The revised manual is then fixed for the main study. Pilot coding does not enter the main analysis; the revisions and their reasons are recorded in the pilot log.</w:t>
       </w:r>
     </w:p>
     <w:p>
@@ -4153,7 +4153,7 @@
           <w:sz w:val="24"/>
           <w:szCs w:val="24"/>
         </w:rPr>
-        <w:t xml:space="preserve">The primary analyses are organised by research question: RQ1—pass-to-pass consistency; RQ2—agreement and the correction gap; RQ3—evidence-checked analysis of the justifications for selected divergent and close-agreement scripts, with inter-coder agreement on the procedure’s judgements. The synthesis draws on all three RQs. Holm (1979) correction is applied within each family of primary mixed-model contrasts. With three passes, the ICC(1,1) per condition rests on three scores per script, providing a within-script variance estimate that does not depend on a single difference. The study reports ICC(1,1) as a tool-level aggregate and supplements it with per-script standard deviations across the three passes.</w:t>
+        <w:t xml:space="preserve">The primary analyses are organised by research question: RQ1—pass-to-pass consistency; RQ2—agreement and the correction gap; RQ3—evidence-checked analysis of the justifications for selected divergent and close-agreement scripts, with inter-coder agreement on the procedure’s judgements. The synthesis draws on all three RQs. Holm (1979) correction is applied within each family of primary mixed-model contrasts. With three passes, the ICC(1,1) per condition rests on three scores per script. The study reports ICC(1,1) as a tool-level aggregate and supplements it with per-script standard deviations across the three passes.</w:t>
       </w:r>
     </w:p>
     <w:p>
@@ -4297,7 +4297,7 @@
           <w:sz w:val="24"/>
           <w:szCs w:val="24"/>
         </w:rPr>
-        <w:t xml:space="preserve">The correction gap is the AI score minus the mean of the two human raters, computed per pass and per passage and summarised as mean, standard deviation and range across the three passes. The three-pass design allows the correction gap’s variability across passes to be estimated, rather than characterised by a single difference. Score level is defined by the mean of the AI and human scores (Bland &amp; Altman, 1986), because grouping by the human score alone produces a regression-to-the-mean artefact.</w:t>
+        <w:t xml:space="preserve">The correction gap is the AI score minus the mean of the two human raters, computed per pass and per passage and summarised as mean, standard deviation and range across the three passes. The three-pass design allows the correction gap’s variability across passes to be estimated. Score level is defined by the mean of the AI and human scores (Bland &amp; Altman, 1986), because grouping by the human score alone produces a regression-to-the-mean artefact.</w:t>
       </w:r>
     </w:p>
     <w:p>
@@ -4390,7 +4390,7 @@
           <w:sz w:val="24"/>
           <w:szCs w:val="24"/>
         </w:rPr>
-        <w:t xml:space="preserve">3. Opposite direction: the script with the largest absolute proportional gap on either criterion whose sign is opposite to the reference direction (AI under-scoring if the reference is over-scoring, and vice versa). The reference direction is the sign of the gap that led to script 1’s selection; if that gap is zero, or if two gaps of equal size and opposite sign tied for it, AI over-scoring is used as the reference. If no script has a gap in the opposite direction, the next-largest gap on either criterion is selected and this is reported.</w:t>
+        <w:t xml:space="preserve">3. Opposite direction: the script with the largest absolute proportional gap on either criterion whose sign is opposite to the reference direction (AI under-scoring if the reference is over-scoring, and vice versa). The reference direction is the sign of the gap that led to script 1’s selection; if that gap is zero, or if two gaps of equal size and opposite sign are tied for it, AI over-scoring is used as the reference. If no script has a gap in the opposite direction, the next-largest gap on either criterion is selected and this is reported.</w:t>
       </w:r>
     </w:p>
     <w:p>
@@ -4519,7 +4519,7 @@
           <w:sz w:val="24"/>
           <w:szCs w:val="24"/>
         </w:rPr>
-        <w:t xml:space="preserve">AI explicitly applies a level descriptor to the wrong criterion—for example, citing fluency or style as the reason for reading credit, or penalising content selection under the writing mark. Construct confusion is coded when a claim is judged misattributed in the evidence record (below); a human–AI disagreement alone does not establish an AI error</w:t>
+        <w:t xml:space="preserve">AI explicitly applies a level descriptor to the wrong criterion—for example, citing fluency or style as the reason for reading credit, or penalising content selection under the writing mark. This code is applied as defined in the evidence-checking procedure below; a human–AI disagreement alone does not establish an AI error</w:t>
       </w:r>
     </w:p>
     <w:p>
@@ -4568,7 +4568,7 @@
           <w:sz w:val="24"/>
           <w:szCs w:val="24"/>
         </w:rPr>
-        <w:t xml:space="preserve">For each of the 8 selected scripts, a structured evidence record will be compiled before coding begins. For each AI rationale claim (e.g., “the student included point X” or “the summary lacks own-words transformation”), the record documents: (a) the AI’s specific claim and the mark it is offered for (reading or writing); (b) the relevant student wording and corresponding source-passage evidence; (c) the applicable reading or writing level descriptor; (d) an evidential judgement using four defined categories: supported (the claim is borne out by the student text and source); contradicted (the claim is demonstrably false—for example, crediting a content point the summary does not contain); insufficient explanation (the claim is too general to show the basis of the mark—for example, “clear and fluent” offered alongside a reading mark); and ambiguous (the evidence allows more than one defensible reading); and (e) a criterion-appropriateness judgement: appropriate (the quality the claim cites is one the descriptor for that mark assesses), misattributed (the quality belongs to the other criterion’s descriptor) or unclear. The two judgements are kept separate because a claim can be true but inappropriate: “the summary is fluent” may be supported by the text, yet it is not a basis for reading credit. A rationale that omits content evidence is not, on that ground alone, treated as evidence of mis-scoring: a short explanation may accompany a defensible mark. Contradicted claims are coded under the relevant evidence-error category; for example, crediting a content point the student omitted is a source-fidelity error. Construct confusion is coded when a claim is judged misattributed—for example, citing fluency as the reason for reading credit. A draft evidence-record template, with an invented illustrative example, is given in Appendix D. The second human rater will independently examine the 8 selected scripts and their AI rationales, completing the same evidence record, before seeing the candidate’s judgements. The raters’ original independent marks are preserved and not revisited. This procedure grounds the content analysis in verifiable textual evidence rather than impressionistic comparison.</w:t>
+        <w:t xml:space="preserve">For each of the 8 selected scripts, a structured evidence record will be compiled before coding begins. For each AI rationale claim (e.g., “the student included point X” or “the summary lacks own-words transformation”), the record documents: (a) the AI’s specific claim and the mark it is offered for (reading or writing); (b) the relevant student wording and corresponding source-passage evidence; (c) the applicable reading or writing level descriptor; (d) an evidential judgement using four defined categories: supported (the claim is borne out by the student text and source); contradicted (the claim is demonstrably false—for example, crediting a content point the summary does not contain); insufficient explanation (the claim is too general to show the basis of the mark—for example, “shows good understanding” with no reference to content); and ambiguous (the evidence allows more than one defensible reading); and (e) a criterion-appropriateness judgement: appropriate (the quality the claim cites is one the descriptor for that mark assesses), misattributed (the quality belongs to the other criterion’s descriptor) or unclear. The two judgements are kept separate because a claim can be true but inappropriate: “the summary is fluent” may be supported by the text, yet it is not a basis for reading credit. A rationale that omits content evidence is not, on that ground alone, treated as evidence of mis-scoring: a short explanation may accompany a defensible mark. Contradicted claims are coded under the relevant evidence-error category; for example, crediting a content point the student omitted is a source-fidelity error. Construct confusion is coded when a claim is judged misattributed—for example, citing fluency as the reason for reading credit. A draft evidence-record template, with an invented illustrative example, is given in Appendix D. The second human rater will independently examine the 8 selected scripts and their AI rationales, completing the same evidence record, before seeing the candidate’s judgements. The raters’ original independent marks are preserved and not revisited. This procedure grounds the content analysis in verifiable textual evidence rather than impressionistic comparison.</w:t>
       </w:r>
     </w:p>
     <w:p>
@@ -4606,7 +4606,7 @@
           <w:sz w:val="24"/>
           <w:szCs w:val="24"/>
         </w:rPr>
-        <w:t xml:space="preserve">Coding will be conducted independently by both the candidate and the second human rater using the same coding scheme. Coding will be organised in Atlas.ti. Both coders will complete the full evidence-checking procedure for all 8 selected scripts (16 rationale texts) before comparing their coding. The coding unit is the individual claim within a rationale text. Before independent coding begins, the candidate will segment each rationale into its constituent claims, following written segmentation guidelines in the coding manual, and prepare a numbered claim list; the second coder will receive this same pre-segmented list, so that both coders' present/absent decisions refer to identical units. For each claim, each thematic code is treated as a separate present/absent decision: a single claim may receive more than one code (e.g., both construct-irrelevant rewarding and rubric misapplication), and inter-coder agreement is calculated on each per-claim binary decision. Inter-coder agreement will be reported as percentage agreement and Cohen’s kappa, calculated before discussion, for three sets of per-claim decisions: the four-way evidential judgement, the three-way criterion-appropriateness judgement and each binary thematic-code decision. These figures are the study’s evidence on how consistently the procedure can be applied. The coding manual is fixed after the protocol pilot (Section 3.6). If a category definition must be revised during main coding, the revision and its reason are logged, both coders recode all previously coded claims under the revised definition, and agreement is reported both for the coding completed before the revision and for the final coding. Disagreements will then be discussed and resolved where possible. The discussion is not recorded; instead, a written log records, for each disputed claim, both coders’ initial decisions, the final decision (or “unresolved”) and a one-line reason. Unresolved cases are reported. The supervisor will review the final coding of three selected scripts as an additional credibility check. This dual-coding procedure strengthens the qualitative strand’s trustworthiness.</w:t>
+        <w:t xml:space="preserve">Coding will be conducted independently by both the candidate and the second human rater using the same coding scheme. Coding will be organised in Atlas.ti. Both coders will complete the full evidence-checking procedure for all 8 selected scripts (16 rationale texts) before comparing their coding. The coding unit is the individual claim within a rationale text. Before independent coding begins, the candidate will segment each rationale into its constituent claims, following written segmentation guidelines in the coding manual, and prepare a numbered claim list; the second coder will receive this same pre-segmented list, so that all coding decisions refer to identical units. For each claim, each thematic code is treated as a separate present/absent decision: a single claim may receive more than one code (e.g., both construct-irrelevant rewarding and rubric misapplication), and inter-coder agreement is calculated on each per-claim binary decision. Inter-coder agreement will be reported as percentage agreement and Cohen’s kappa, calculated before discussion, for three sets of per-claim decisions: the four-way evidential judgement, the three-way criterion-appropriateness judgement and each binary thematic-code decision. These figures are the study’s evidence on how consistently the procedure can be applied. The coding manual is fixed after the protocol pilot (Section 3.6). If a category definition must be revised during main coding, the revision and its reason are logged, both coders recode all previously coded claims under the revised definition, and agreement is reported both for the coding completed before the revision and for the final coding. Disagreements will then be discussed and resolved where possible. The discussion is not recorded; instead, a written evidence-review log records, for each disputed claim, both coders’ initial decisions, the final decision (or “unresolved”) and a one-line reason. Unresolved cases are reported. The supervisor will review the final coding of three selected scripts as an additional credibility check. This dual-coding procedure strengthens the qualitative strand’s trustworthiness.</w:t>
       </w:r>
     </w:p>
     <w:p>
@@ -4644,7 +4644,7 @@
           <w:sz w:val="24"/>
           <w:szCs w:val="24"/>
         </w:rPr>
-        <w:t xml:space="preserve">The synthesis draws on RQ1–RQ3 to: (a) summarise pass-to-pass consistency and agreement with human raters, including the direction and magnitude of the correction gap, by tool, passage and criterion (from RQ1 and RQ2); (b) describe the rubric-related concerns illustrated by the selected cases (from RQ3); and (c) identify the questions that require further validation before classroom adoption. The quantitative results support comparisons of consistency and agreement across conditions; the selected cases illustrate how problems arise but cannot rank how often they occur in each condition. Consistent with the scope set in Section 1.3, the synthesis provides the descriptive evidence a teacher or school would need to make an informed decision about whether and how to use a consumer AI tool as a second marker for this task. Whether teachers find the correction-gap evidence interpretable and actionable is a question for future research.</w:t>
+        <w:t xml:space="preserve">The synthesis draws on RQ1–RQ3 to: (a) summarise pass-to-pass consistency and agreement with human raters, including the direction and magnitude of the correction gap, by tool, passage and criterion (from RQ1 and RQ2); (b) describe the rubric-related concerns illustrated by the selected cases (from RQ3); and (c) identify the questions that require further validation before classroom adoption. The quantitative results support comparisons of consistency and agreement across conditions; the selected cases illustrate how problems arise but cannot rank how often they occur in each condition. Consistent with the scope set in Section 1.3, the synthesis provides descriptive evidence to inform further evaluation of consumer AI tools as second markers for this task. Whether teachers find the correction-gap evidence interpretable and actionable is a question for future research.</w:t>
       </w:r>
     </w:p>
     <w:p>
@@ -4668,7 +4668,7 @@
           <w:sz w:val="24"/>
           <w:szCs w:val="24"/>
         </w:rPr>
-        <w:t xml:space="preserve">If AI–human agreement is high across both tools and both passages, and the content analysis reveals no systematic patterns of construct confusion or construct-irrelevant scoring, this outcome is reported as evidence that consumer AI scoring of this task, under the study’s conditions, agreed closely with human judgement. The study’s contribution in that case lies in having established the agreement level under ecological conditions, not in having found a problem. If anticipated patterns (e.g., confusion of reading and writing constructs, penalisation of multilingual learners’ language features) do not appear in the selected rationales, this is reported as a non-finding in the selected cases. Because only eight scripts are examined, such an absence would not demonstrate that construct problems are absent across the corpus. The preregistered analysis plan will include this contingency.</w:t>
+        <w:t xml:space="preserve">If AI–human agreement is high across both tools and both passages, and the content analysis shows no instances, in the selected cases, of construct confusion or construct-irrelevant scoring, this outcome is reported as evidence that consumer AI scoring of this task, under the study’s conditions, agreed closely with human judgement. The study’s contribution in that case lies in having established the agreement level under ecological conditions, not in having found a problem. If anticipated patterns (e.g., confusion of reading and writing constructs, penalisation of multilingual learners’ language features) do not appear in the selected rationales, this is reported as a non-finding in the selected cases. Because only eight scripts are examined, such an absence would not demonstrate that construct problems are absent across the corpus. The preregistered analysis plan will include this contingency.</w:t>
       </w:r>
     </w:p>
     <w:p>
@@ -5313,7 +5313,7 @@
                 <w:sz w:val="22"/>
                 <w:szCs w:val="22"/>
               </w:rPr>
-              <w:t xml:space="preserve">Fix the prompt wording. Run live pilot on third passage with colleague’s class (~10–15 students, three passes per tool, ~60–90 AI submissions plus third passage preparation, recruitment, transcription and human marking). Compute preliminary repeatability assessment. Check H1–H2 agreement on pilot data; if reading- or writing-mark ICC(A,1) &lt; .60, conduct second calibration round before main-study marking. Both coders pilot the evidence-checking procedure on pilot AI responses; fix the coding manual. Discuss expected CI width with statistical adviser. Use results to finalise anchors and timings. Fix and preregister the analysis plan before main-study data collection.</w:t>
+              <w:t xml:space="preserve">Run live pilot on third passage with colleague’s class (~10–15 students, three passes per tool, ~60–90 AI submissions plus third passage preparation, recruitment, transcription and human marking). Compute preliminary repeatability assessment. Check H1–H2 agreement on pilot data; if reading- or writing-mark ICC(A,1) &lt; .60, conduct second calibration round before main-study marking. Both coders pilot the evidence-checking procedure on pilot AI responses. Finalise and fix the prompt wording and coding manual after the pilot. Discuss expected CI width with statistical adviser. Use results to finalise anchors and timings. Fix and preregister the analysis plan before main-study data collection.</w:t>
             </w:r>
           </w:p>
         </w:tc>
@@ -6310,7 +6310,7 @@
                 <w:sz w:val="22"/>
                 <w:szCs w:val="22"/>
               </w:rPr>
-              <w:t xml:space="preserve">Three passes provide a within-script variance estimate based on three data points rather than a single difference; individual-script precision remains limited, and the expected precision of tool-level ICC(1,1) will be assessed with the statistical adviser before preregistration. More passes would improve precision but exceed the study’s practical constraints.</w:t>
+              <w:t xml:space="preserve">Individual-script precision with three passes remains limited, and the expected precision of tool-level ICC(1,1) will be assessed with the statistical adviser before preregistration. More passes would improve precision but exceed the study’s practical constraints.</w:t>
             </w:r>
           </w:p>
         </w:tc>
@@ -6841,7 +6841,7 @@
           <w:sz w:val="24"/>
           <w:szCs w:val="24"/>
         </w:rPr>
-        <w:t xml:space="preserve">Conceptually, it will extend argument-based validation of AI scoring by treating construct representation as a separate inference, evidenced through criterion-level checks of the tools’ stated justifications. The scoring correction gap serves as an organising label for this analysis rather than as a new construct. The reading–writing criterion-separation analysis will contribute to the broader question of whether AI scoring confuses reading and writing constructs or introduces construct-irrelevant variance for multilingual populations on source-based tasks.</w:t>
+        <w:t xml:space="preserve">Conceptually, it will extend argument-based validation of AI scoring by treating construct representation as a separate inference, evidenced through criterion-level checks of the tools’ stated justifications. The scoring correction gap serves as an organising label for this analysis rather than as a new construct. The reading–writing criterion-separation analysis will contribute evidence, within this multilingual sample, on whether AI scoring confuses reading and writing constructs or introduces construct-irrelevant variance on a source-based task.</w:t>
       </w:r>
     </w:p>
     <w:p>
@@ -10626,7 +10626,7 @@
                 <w:sz w:val="22"/>
                 <w:szCs w:val="22"/>
               </w:rPr>
-              <w:t xml:space="preserve">Construct confusion</w:t>
+              <w:t xml:space="preserve">Rubric misapplication and construct confusion</w:t>
             </w:r>
           </w:p>
         </w:tc>
@@ -10745,7 +10745,7 @@
           <w:sz w:val="22"/>
           <w:szCs w:val="22"/>
         </w:rPr>
-        <w:t xml:space="preserve">Anthropic. (2025a, August 27). Anthropic Education Report: How educators use Claude. https://www.anthropic.com/news/anthropic-education-report-how-educators-use-claude</w:t>
+        <w:t xml:space="preserve">Anthropic. (2025, August 27). Anthropic Education Report: How educators use Claude. https://www.anthropic.com/news/anthropic-education-report-how-educators-use-claude</w:t>
       </w:r>
     </w:p>
     <w:p>

</xml_diff>